<commit_message>
Move Final Pseudocode TInyCUA.docx to src/tinycua/docs/pseudocode/
</commit_message>
<xml_diff>
--- a/src/tinycua/docs/pseudocode/Final Pseudocode TInyCUA.docx
+++ b/src/tinycua/docs/pseudocode/Final Pseudocode TInyCUA.docx
@@ -581,7 +581,7 @@
                 <w:sz w:val="20"/>
                 <w:szCs w:val="20"/>
               </w:rPr>
-              <w:t xml:space="preserve">    // Step 3: Two-step classification (LLM + tool)</w:t>
+              <w:t xml:space="preserve">    // Two-step classification (LLM + tool)</w:t>
             </w:r>
           </w:p>
         </w:tc>
@@ -977,6 +977,23 @@
             <w:r>
               <w:rPr>
                 <w:rFonts w:ascii="Times New Roman" w:eastAsia="SimSun" w:hAnsi="Times New Roman" w:cs="Times New Roman"/>
+                <w:sz w:val="20"/>
+                <w:szCs w:val="20"/>
+              </w:rPr>
+              <w:br/>
+            </w:r>
+            <w:r>
+              <w:rPr>
+                <w:rFonts w:ascii="Times New Roman" w:eastAsia="SimSun" w:hAnsi="Times New Roman" w:cs="Times New Roman"/>
+                <w:i/>
+                <w:sz w:val="20"/>
+                <w:szCs w:val="20"/>
+              </w:rPr>
+              <w:t xml:space="preserve">  </w:t>
+            </w:r>
+            <w:r>
+              <w:rPr>
+                <w:rFonts w:ascii="Times New Roman" w:eastAsia="SimSun" w:hAnsi="Times New Roman" w:cs="Times New Roman"/>
                 <w:i/>
                 <w:sz w:val="20"/>
                 <w:szCs w:val="20"/>
@@ -1167,7 +1184,7 @@
                 <w:sz w:val="20"/>
                 <w:szCs w:val="20"/>
               </w:rPr>
-              <w:t xml:space="preserve">    // Step 4: Dispatch via route map</w:t>
+              <w:t xml:space="preserve">    // Dispatch via route map</w:t>
             </w:r>
           </w:p>
         </w:tc>
@@ -1325,7 +1342,7 @@
             <w:r>
               <w:rPr>
                 <w:rFonts w:ascii="Times New Roman" w:eastAsia="SimSun" w:hAnsi="Times New Roman" w:cs="Times New Roman"/>
-                <w:b/>
+                <w:bCs/>
                 <w:sz w:val="20"/>
                 <w:szCs w:val="20"/>
               </w:rPr>
@@ -1511,7 +1528,25 @@
                 <w:sz w:val="20"/>
                 <w:szCs w:val="20"/>
               </w:rPr>
-              <w:t xml:space="preserve"> Passthrough then</w:t>
+              <w:t xml:space="preserve"> </w:t>
+            </w:r>
+            <w:r>
+              <w:rPr>
+                <w:rFonts w:ascii="Times New Roman" w:eastAsia="SimSun" w:hAnsi="Times New Roman" w:cs="Times New Roman"/>
+                <w:bCs/>
+                <w:sz w:val="20"/>
+                <w:szCs w:val="20"/>
+              </w:rPr>
+              <w:t>Passthrough</w:t>
+            </w:r>
+            <w:r>
+              <w:rPr>
+                <w:rFonts w:ascii="Times New Roman" w:eastAsia="SimSun" w:hAnsi="Times New Roman" w:cs="Times New Roman"/>
+                <w:b/>
+                <w:sz w:val="20"/>
+                <w:szCs w:val="20"/>
+              </w:rPr>
+              <w:t xml:space="preserve"> then</w:t>
             </w:r>
           </w:p>
         </w:tc>
@@ -3120,7 +3155,7 @@
             <w:r>
               <w:rPr>
                 <w:rFonts w:ascii="Times New Roman" w:hAnsi="Times New Roman" w:cs="Times New Roman"/>
-                <w:b/>
+                <w:bCs/>
                 <w:color w:val="000000"/>
                 <w:sz w:val="20"/>
                 <w:szCs w:val="20"/>
@@ -3326,12 +3361,218 @@
             <w:r>
               <w:rPr>
                 <w:rFonts w:ascii="Times New Roman" w:hAnsi="Times New Roman" w:cs="Times New Roman"/>
+                <w:bCs/>
+                <w:color w:val="000000"/>
+                <w:sz w:val="20"/>
+                <w:szCs w:val="20"/>
+              </w:rPr>
+              <w:t>task_recreation</w:t>
+            </w:r>
+            <w:r>
+              <w:rPr>
+                <w:rFonts w:ascii="Times New Roman" w:hAnsi="Times New Roman" w:cs="Times New Roman"/>
+                <w:color w:val="000000"/>
+                <w:sz w:val="20"/>
+                <w:szCs w:val="20"/>
+              </w:rPr>
+              <w:t xml:space="preserve"> </w:t>
+            </w:r>
+            <w:r>
+              <w:rPr>
+                <w:rFonts w:ascii="Times New Roman" w:hAnsi="Times New Roman" w:cs="Times New Roman"/>
                 <w:b/>
                 <w:color w:val="000000"/>
                 <w:sz w:val="20"/>
                 <w:szCs w:val="20"/>
               </w:rPr>
-              <w:t>task_recreation</w:t>
+              <w:t>then</w:t>
+            </w:r>
+          </w:p>
+        </w:tc>
+      </w:tr>
+      <w:tr>
+        <w:tc>
+          <w:tcPr>
+            <w:tcW w:w="680" w:type="dxa"/>
+          </w:tcPr>
+          <w:p>
+            <w:pPr>
+              <w:spacing w:before="20" w:after="20"/>
+              <w:rPr>
+                <w:rFonts w:ascii="Times New Roman" w:hAnsi="Times New Roman" w:cs="Times New Roman"/>
+                <w:sz w:val="20"/>
+                <w:szCs w:val="20"/>
+              </w:rPr>
+            </w:pPr>
+            <w:r>
+              <w:rPr>
+                <w:rFonts w:ascii="Times New Roman" w:hAnsi="Times New Roman" w:cs="Times New Roman"/>
+                <w:color w:val="000000"/>
+                <w:sz w:val="20"/>
+                <w:szCs w:val="20"/>
+              </w:rPr>
+              <w:t>11:</w:t>
+            </w:r>
+          </w:p>
+        </w:tc>
+        <w:tc>
+          <w:tcPr>
+            <w:tcW w:w="8504" w:type="dxa"/>
+          </w:tcPr>
+          <w:p>
+            <w:pPr>
+              <w:spacing w:before="20" w:after="20"/>
+              <w:rPr>
+                <w:rFonts w:ascii="Times New Roman" w:hAnsi="Times New Roman" w:cs="Times New Roman"/>
+                <w:sz w:val="20"/>
+                <w:szCs w:val="20"/>
+              </w:rPr>
+            </w:pPr>
+            <w:r>
+              <w:rPr>
+                <w:rFonts w:ascii="Times New Roman" w:hAnsi="Times New Roman" w:cs="Times New Roman"/>
+                <w:sz w:val="20"/>
+                <w:szCs w:val="20"/>
+              </w:rPr>
+              <w:t xml:space="preserve">    remove all nodes after Worker from queue</w:t>
+            </w:r>
+          </w:p>
+        </w:tc>
+      </w:tr>
+      <w:tr>
+        <w:tc>
+          <w:tcPr>
+            <w:tcW w:w="680" w:type="dxa"/>
+          </w:tcPr>
+          <w:p>
+            <w:pPr>
+              <w:spacing w:before="20" w:after="20"/>
+              <w:rPr>
+                <w:rFonts w:ascii="Times New Roman" w:hAnsi="Times New Roman" w:cs="Times New Roman"/>
+                <w:sz w:val="20"/>
+                <w:szCs w:val="20"/>
+              </w:rPr>
+            </w:pPr>
+            <w:r>
+              <w:rPr>
+                <w:rFonts w:ascii="Times New Roman" w:hAnsi="Times New Roman" w:cs="Times New Roman"/>
+                <w:color w:val="000000"/>
+                <w:sz w:val="20"/>
+                <w:szCs w:val="20"/>
+              </w:rPr>
+              <w:t>12:</w:t>
+            </w:r>
+          </w:p>
+        </w:tc>
+        <w:tc>
+          <w:tcPr>
+            <w:tcW w:w="8504" w:type="dxa"/>
+          </w:tcPr>
+          <w:p>
+            <w:pPr>
+              <w:spacing w:before="20" w:after="20"/>
+              <w:rPr>
+                <w:rFonts w:ascii="Times New Roman" w:hAnsi="Times New Roman" w:cs="Times New Roman"/>
+                <w:sz w:val="20"/>
+                <w:szCs w:val="20"/>
+              </w:rPr>
+            </w:pPr>
+            <w:r>
+              <w:rPr>
+                <w:rFonts w:ascii="Times New Roman" w:hAnsi="Times New Roman" w:cs="Times New Roman"/>
+                <w:color w:val="000000"/>
+                <w:sz w:val="20"/>
+                <w:szCs w:val="20"/>
+              </w:rPr>
+              <w:t xml:space="preserve">    </w:t>
+            </w:r>
+            <w:r>
+              <w:rPr>
+                <w:rFonts w:ascii="Times New Roman" w:hAnsi="Times New Roman" w:cs="Times New Roman"/>
+                <w:i/>
+                <w:color w:val="000000"/>
+                <w:sz w:val="20"/>
+                <w:szCs w:val="20"/>
+              </w:rPr>
+              <w:t>queue</w:t>
+            </w:r>
+            <w:r>
+              <w:rPr>
+                <w:rFonts w:ascii="Times New Roman" w:hAnsi="Times New Roman" w:cs="Times New Roman"/>
+                <w:color w:val="000000"/>
+                <w:sz w:val="20"/>
+                <w:szCs w:val="20"/>
+              </w:rPr>
+              <w:t xml:space="preserve"> ← [</w:t>
+            </w:r>
+            <w:r>
+              <w:rPr>
+                <w:rFonts w:ascii="Times New Roman" w:hAnsi="Times New Roman" w:cs="Times New Roman"/>
+                <w:color w:val="000000"/>
+                <w:sz w:val="20"/>
+                <w:szCs w:val="20"/>
+              </w:rPr>
+              <w:t>TaskAnalyzer (init), AnalysisEffort, TaskExecutor, …</w:t>
+            </w:r>
+            <w:r>
+              <w:rPr>
+                <w:rFonts w:ascii="Times New Roman" w:hAnsi="Times New Roman" w:cs="Times New Roman"/>
+                <w:color w:val="000000"/>
+                <w:sz w:val="20"/>
+                <w:szCs w:val="20"/>
+              </w:rPr>
+              <w:t>]</w:t>
+            </w:r>
+          </w:p>
+        </w:tc>
+      </w:tr>
+      <w:tr>
+        <w:tc>
+          <w:tcPr>
+            <w:tcW w:w="680" w:type="dxa"/>
+          </w:tcPr>
+          <w:p>
+            <w:pPr>
+              <w:spacing w:before="20" w:after="20"/>
+              <w:rPr>
+                <w:rFonts w:ascii="Times New Roman" w:hAnsi="Times New Roman" w:cs="Times New Roman"/>
+                <w:sz w:val="20"/>
+                <w:szCs w:val="20"/>
+              </w:rPr>
+            </w:pPr>
+            <w:r>
+              <w:rPr>
+                <w:rFonts w:ascii="Times New Roman" w:hAnsi="Times New Roman" w:cs="Times New Roman"/>
+                <w:color w:val="000000"/>
+                <w:sz w:val="20"/>
+                <w:szCs w:val="20"/>
+              </w:rPr>
+              <w:t>13:</w:t>
+            </w:r>
+          </w:p>
+        </w:tc>
+        <w:tc>
+          <w:tcPr>
+            <w:tcW w:w="8504" w:type="dxa"/>
+          </w:tcPr>
+          <w:p>
+            <w:pPr>
+              <w:spacing w:before="20" w:after="20"/>
+              <w:rPr>
+                <w:rFonts w:ascii="Times New Roman" w:hAnsi="Times New Roman" w:cs="Times New Roman"/>
+                <w:sz w:val="20"/>
+                <w:szCs w:val="20"/>
+              </w:rPr>
+            </w:pPr>
+            <w:r>
+              <w:rPr>
+                <w:rFonts w:ascii="Times New Roman" w:hAnsi="Times New Roman" w:cs="Times New Roman"/>
+                <w:b/>
+                <w:color w:val="000000"/>
+                <w:sz w:val="20"/>
+                <w:szCs w:val="20"/>
+              </w:rPr>
+              <w:t>else if</w:t>
             </w:r>
             <w:r>
               <w:rPr>
@@ -3345,6 +3586,44 @@
             <w:r>
               <w:rPr>
                 <w:rFonts w:ascii="Times New Roman" w:hAnsi="Times New Roman" w:cs="Times New Roman"/>
+                <w:i/>
+                <w:color w:val="000000"/>
+                <w:sz w:val="20"/>
+                <w:szCs w:val="20"/>
+              </w:rPr>
+              <w:t>route</w:t>
+            </w:r>
+            <w:r>
+              <w:rPr>
+                <w:rFonts w:ascii="Times New Roman" w:hAnsi="Times New Roman" w:cs="Times New Roman"/>
+                <w:color w:val="000000"/>
+                <w:sz w:val="20"/>
+                <w:szCs w:val="20"/>
+              </w:rPr>
+              <w:t xml:space="preserve"> = </w:t>
+            </w:r>
+            <w:r>
+              <w:rPr>
+                <w:rFonts w:ascii="Times New Roman" w:hAnsi="Times New Roman" w:cs="Times New Roman"/>
+                <w:bCs/>
+                <w:color w:val="000000"/>
+                <w:sz w:val="20"/>
+                <w:szCs w:val="20"/>
+              </w:rPr>
+              <w:t>task_reanalysis</w:t>
+            </w:r>
+            <w:r>
+              <w:rPr>
+                <w:rFonts w:ascii="Times New Roman" w:hAnsi="Times New Roman" w:cs="Times New Roman"/>
+                <w:color w:val="000000"/>
+                <w:sz w:val="20"/>
+                <w:szCs w:val="20"/>
+              </w:rPr>
+              <w:t xml:space="preserve"> </w:t>
+            </w:r>
+            <w:r>
+              <w:rPr>
+                <w:rFonts w:ascii="Times New Roman" w:hAnsi="Times New Roman" w:cs="Times New Roman"/>
                 <w:b/>
                 <w:color w:val="000000"/>
                 <w:sz w:val="20"/>
@@ -3376,7 +3655,7 @@
                 <w:sz w:val="20"/>
                 <w:szCs w:val="20"/>
               </w:rPr>
-              <w:t>11:</w:t>
+              <w:t>14:</w:t>
             </w:r>
           </w:p>
         </w:tc>
@@ -3425,7 +3704,7 @@
                 <w:sz w:val="20"/>
                 <w:szCs w:val="20"/>
               </w:rPr>
-              <w:t>12:</w:t>
+              <w:t>15:</w:t>
             </w:r>
           </w:p>
         </w:tc>
@@ -3468,16 +3747,16 @@
                 <w:sz w:val="20"/>
                 <w:szCs w:val="20"/>
               </w:rPr>
-              <w:t xml:space="preserve"> ← [</w:t>
-            </w:r>
-            <w:r>
-              <w:rPr>
-                <w:rFonts w:ascii="Times New Roman" w:hAnsi="Times New Roman" w:cs="Times New Roman"/>
-                <w:color w:val="000000"/>
-                <w:sz w:val="20"/>
-                <w:szCs w:val="20"/>
-              </w:rPr>
-              <w:t>TaskAnalyzer (init), AnalysisEffort, TaskExecutor, …</w:t>
+              <w:t xml:space="preserve"> ← </w:t>
+            </w:r>
+            <w:r>
+              <w:rPr>
+                <w:rFonts w:ascii="Times New Roman" w:hAnsi="Times New Roman" w:cs="Times New Roman"/>
+                <w:color w:val="000000"/>
+                <w:sz w:val="20"/>
+                <w:szCs w:val="20"/>
+              </w:rPr>
+              <w:t>[TaskAnalyzer, AnalysisEffort, TaskExecutor, …</w:t>
             </w:r>
             <w:r>
               <w:rPr>
@@ -3512,7 +3791,7 @@
                 <w:sz w:val="20"/>
                 <w:szCs w:val="20"/>
               </w:rPr>
-              <w:t>13:</w:t>
+              <w:t>16:</w:t>
             </w:r>
           </w:p>
         </w:tc>
@@ -3570,12 +3849,169 @@
             <w:r>
               <w:rPr>
                 <w:rFonts w:ascii="Times New Roman" w:hAnsi="Times New Roman" w:cs="Times New Roman"/>
+                <w:bCs/>
+                <w:color w:val="000000"/>
+                <w:sz w:val="20"/>
+                <w:szCs w:val="20"/>
+              </w:rPr>
+              <w:t>passthrough</w:t>
+            </w:r>
+            <w:r>
+              <w:rPr>
+                <w:rFonts w:ascii="Times New Roman" w:hAnsi="Times New Roman" w:cs="Times New Roman"/>
+                <w:color w:val="000000"/>
+                <w:sz w:val="20"/>
+                <w:szCs w:val="20"/>
+              </w:rPr>
+              <w:t xml:space="preserve"> </w:t>
+            </w:r>
+            <w:r>
+              <w:rPr>
+                <w:rFonts w:ascii="Times New Roman" w:hAnsi="Times New Roman" w:cs="Times New Roman"/>
                 <w:b/>
                 <w:color w:val="000000"/>
                 <w:sz w:val="20"/>
                 <w:szCs w:val="20"/>
               </w:rPr>
-              <w:t>task_reanalysis</w:t>
+              <w:t>then</w:t>
+            </w:r>
+          </w:p>
+        </w:tc>
+      </w:tr>
+      <w:tr>
+        <w:tc>
+          <w:tcPr>
+            <w:tcW w:w="680" w:type="dxa"/>
+          </w:tcPr>
+          <w:p>
+            <w:pPr>
+              <w:spacing w:before="20" w:after="20"/>
+              <w:rPr>
+                <w:rFonts w:ascii="Times New Roman" w:hAnsi="Times New Roman" w:cs="Times New Roman"/>
+                <w:sz w:val="20"/>
+                <w:szCs w:val="20"/>
+              </w:rPr>
+            </w:pPr>
+            <w:r>
+              <w:rPr>
+                <w:rFonts w:ascii="Times New Roman" w:hAnsi="Times New Roman" w:cs="Times New Roman"/>
+                <w:color w:val="000000"/>
+                <w:sz w:val="20"/>
+                <w:szCs w:val="20"/>
+              </w:rPr>
+              <w:t>17:</w:t>
+            </w:r>
+          </w:p>
+        </w:tc>
+        <w:tc>
+          <w:tcPr>
+            <w:tcW w:w="8504" w:type="dxa"/>
+          </w:tcPr>
+          <w:p>
+            <w:pPr>
+              <w:spacing w:before="20" w:after="20"/>
+              <w:rPr>
+                <w:rFonts w:ascii="Times New Roman" w:hAnsi="Times New Roman" w:cs="Times New Roman"/>
+                <w:sz w:val="20"/>
+                <w:szCs w:val="20"/>
+              </w:rPr>
+            </w:pPr>
+            <w:r>
+              <w:rPr>
+                <w:rFonts w:ascii="Times New Roman" w:hAnsi="Times New Roman" w:cs="Times New Roman"/>
+                <w:color w:val="000000"/>
+                <w:sz w:val="20"/>
+                <w:szCs w:val="20"/>
+              </w:rPr>
+              <w:t xml:space="preserve">    </w:t>
+            </w:r>
+            <w:r>
+              <w:rPr>
+                <w:rFonts w:ascii="Times New Roman" w:hAnsi="Times New Roman" w:cs="Times New Roman"/>
+                <w:i/>
+                <w:color w:val="000000"/>
+                <w:sz w:val="20"/>
+                <w:szCs w:val="20"/>
+              </w:rPr>
+              <w:t>queue</w:t>
+            </w:r>
+            <w:r>
+              <w:rPr>
+                <w:rFonts w:ascii="Times New Roman" w:hAnsi="Times New Roman" w:cs="Times New Roman"/>
+                <w:color w:val="000000"/>
+                <w:sz w:val="20"/>
+                <w:szCs w:val="20"/>
+              </w:rPr>
+              <w:t xml:space="preserve"> ← </w:t>
+            </w:r>
+            <w:r>
+              <w:rPr>
+                <w:rFonts w:ascii="Times New Roman" w:hAnsi="Times New Roman" w:cs="Times New Roman"/>
+                <w:color w:val="000000"/>
+                <w:sz w:val="20"/>
+                <w:szCs w:val="20"/>
+              </w:rPr>
+              <w:t>[Response</w:t>
+            </w:r>
+            <w:r>
+              <w:rPr>
+                <w:rFonts w:ascii="Times New Roman" w:hAnsi="Times New Roman" w:cs="Times New Roman"/>
+                <w:color w:val="000000"/>
+                <w:sz w:val="20"/>
+                <w:szCs w:val="20"/>
+              </w:rPr>
+              <w:t>]</w:t>
+            </w:r>
+          </w:p>
+        </w:tc>
+      </w:tr>
+      <w:tr>
+        <w:tc>
+          <w:tcPr>
+            <w:tcW w:w="680" w:type="dxa"/>
+          </w:tcPr>
+          <w:p>
+            <w:pPr>
+              <w:spacing w:before="20" w:after="20"/>
+              <w:rPr>
+                <w:rFonts w:ascii="Times New Roman" w:hAnsi="Times New Roman" w:cs="Times New Roman"/>
+                <w:sz w:val="20"/>
+                <w:szCs w:val="20"/>
+              </w:rPr>
+            </w:pPr>
+            <w:r>
+              <w:rPr>
+                <w:rFonts w:ascii="Times New Roman" w:hAnsi="Times New Roman" w:cs="Times New Roman"/>
+                <w:color w:val="000000"/>
+                <w:sz w:val="20"/>
+                <w:szCs w:val="20"/>
+              </w:rPr>
+              <w:t>18:</w:t>
+            </w:r>
+          </w:p>
+        </w:tc>
+        <w:tc>
+          <w:tcPr>
+            <w:tcW w:w="8504" w:type="dxa"/>
+          </w:tcPr>
+          <w:p>
+            <w:pPr>
+              <w:spacing w:before="20" w:after="20"/>
+              <w:rPr>
+                <w:rFonts w:ascii="Times New Roman" w:hAnsi="Times New Roman" w:cs="Times New Roman"/>
+                <w:sz w:val="20"/>
+                <w:szCs w:val="20"/>
+              </w:rPr>
+            </w:pPr>
+            <w:r>
+              <w:rPr>
+                <w:rFonts w:ascii="Times New Roman" w:hAnsi="Times New Roman" w:cs="Times New Roman"/>
+                <w:b/>
+                <w:color w:val="000000"/>
+                <w:sz w:val="20"/>
+                <w:szCs w:val="20"/>
+              </w:rPr>
+              <w:t>else if</w:t>
             </w:r>
             <w:r>
               <w:rPr>
@@ -3589,217 +4025,11 @@
             <w:r>
               <w:rPr>
                 <w:rFonts w:ascii="Times New Roman" w:hAnsi="Times New Roman" w:cs="Times New Roman"/>
-                <w:b/>
-                <w:color w:val="000000"/>
-                <w:sz w:val="20"/>
-                <w:szCs w:val="20"/>
-              </w:rPr>
-              <w:t>then</w:t>
-            </w:r>
-          </w:p>
-        </w:tc>
-      </w:tr>
-      <w:tr>
-        <w:tc>
-          <w:tcPr>
-            <w:tcW w:w="680" w:type="dxa"/>
-          </w:tcPr>
-          <w:p>
-            <w:pPr>
-              <w:spacing w:before="20" w:after="20"/>
-              <w:rPr>
-                <w:rFonts w:ascii="Times New Roman" w:hAnsi="Times New Roman" w:cs="Times New Roman"/>
-                <w:sz w:val="20"/>
-                <w:szCs w:val="20"/>
-              </w:rPr>
-            </w:pPr>
-            <w:r>
-              <w:rPr>
-                <w:rFonts w:ascii="Times New Roman" w:hAnsi="Times New Roman" w:cs="Times New Roman"/>
-                <w:color w:val="000000"/>
-                <w:sz w:val="20"/>
-                <w:szCs w:val="20"/>
-              </w:rPr>
-              <w:t>14:</w:t>
-            </w:r>
-          </w:p>
-        </w:tc>
-        <w:tc>
-          <w:tcPr>
-            <w:tcW w:w="8504" w:type="dxa"/>
-          </w:tcPr>
-          <w:p>
-            <w:pPr>
-              <w:spacing w:before="20" w:after="20"/>
-              <w:rPr>
-                <w:rFonts w:ascii="Times New Roman" w:hAnsi="Times New Roman" w:cs="Times New Roman"/>
-                <w:sz w:val="20"/>
-                <w:szCs w:val="20"/>
-              </w:rPr>
-            </w:pPr>
-            <w:r>
-              <w:rPr>
-                <w:rFonts w:ascii="Times New Roman" w:hAnsi="Times New Roman" w:cs="Times New Roman"/>
-                <w:sz w:val="20"/>
-                <w:szCs w:val="20"/>
-              </w:rPr>
-              <w:t xml:space="preserve">    remove all nodes after Worker from queue</w:t>
-            </w:r>
-          </w:p>
-        </w:tc>
-      </w:tr>
-      <w:tr>
-        <w:tc>
-          <w:tcPr>
-            <w:tcW w:w="680" w:type="dxa"/>
-          </w:tcPr>
-          <w:p>
-            <w:pPr>
-              <w:spacing w:before="20" w:after="20"/>
-              <w:rPr>
-                <w:rFonts w:ascii="Times New Roman" w:hAnsi="Times New Roman" w:cs="Times New Roman"/>
-                <w:sz w:val="20"/>
-                <w:szCs w:val="20"/>
-              </w:rPr>
-            </w:pPr>
-            <w:r>
-              <w:rPr>
-                <w:rFonts w:ascii="Times New Roman" w:hAnsi="Times New Roman" w:cs="Times New Roman"/>
-                <w:color w:val="000000"/>
-                <w:sz w:val="20"/>
-                <w:szCs w:val="20"/>
-              </w:rPr>
-              <w:t>15:</w:t>
-            </w:r>
-          </w:p>
-        </w:tc>
-        <w:tc>
-          <w:tcPr>
-            <w:tcW w:w="8504" w:type="dxa"/>
-          </w:tcPr>
-          <w:p>
-            <w:pPr>
-              <w:spacing w:before="20" w:after="20"/>
-              <w:rPr>
-                <w:rFonts w:ascii="Times New Roman" w:hAnsi="Times New Roman" w:cs="Times New Roman"/>
-                <w:sz w:val="20"/>
-                <w:szCs w:val="20"/>
-              </w:rPr>
-            </w:pPr>
-            <w:r>
-              <w:rPr>
-                <w:rFonts w:ascii="Times New Roman" w:hAnsi="Times New Roman" w:cs="Times New Roman"/>
-                <w:color w:val="000000"/>
-                <w:sz w:val="20"/>
-                <w:szCs w:val="20"/>
-              </w:rPr>
-              <w:t xml:space="preserve">    </w:t>
-            </w:r>
-            <w:r>
-              <w:rPr>
-                <w:rFonts w:ascii="Times New Roman" w:hAnsi="Times New Roman" w:cs="Times New Roman"/>
                 <w:i/>
                 <w:color w:val="000000"/>
                 <w:sz w:val="20"/>
                 <w:szCs w:val="20"/>
               </w:rPr>
-              <w:t>queue</w:t>
-            </w:r>
-            <w:r>
-              <w:rPr>
-                <w:rFonts w:ascii="Times New Roman" w:hAnsi="Times New Roman" w:cs="Times New Roman"/>
-                <w:color w:val="000000"/>
-                <w:sz w:val="20"/>
-                <w:szCs w:val="20"/>
-              </w:rPr>
-              <w:t xml:space="preserve"> ← </w:t>
-            </w:r>
-            <w:r>
-              <w:rPr>
-                <w:rFonts w:ascii="Times New Roman" w:hAnsi="Times New Roman" w:cs="Times New Roman"/>
-                <w:color w:val="000000"/>
-                <w:sz w:val="20"/>
-                <w:szCs w:val="20"/>
-              </w:rPr>
-              <w:t>[TaskAnalyzer, AnalysisEffort, TaskExecutor, …</w:t>
-            </w:r>
-            <w:r>
-              <w:rPr>
-                <w:rFonts w:ascii="Times New Roman" w:hAnsi="Times New Roman" w:cs="Times New Roman"/>
-                <w:color w:val="000000"/>
-                <w:sz w:val="20"/>
-                <w:szCs w:val="20"/>
-              </w:rPr>
-              <w:t>]</w:t>
-            </w:r>
-          </w:p>
-        </w:tc>
-      </w:tr>
-      <w:tr>
-        <w:tc>
-          <w:tcPr>
-            <w:tcW w:w="680" w:type="dxa"/>
-          </w:tcPr>
-          <w:p>
-            <w:pPr>
-              <w:spacing w:before="20" w:after="20"/>
-              <w:rPr>
-                <w:rFonts w:ascii="Times New Roman" w:hAnsi="Times New Roman" w:cs="Times New Roman"/>
-                <w:sz w:val="20"/>
-                <w:szCs w:val="20"/>
-              </w:rPr>
-            </w:pPr>
-            <w:r>
-              <w:rPr>
-                <w:rFonts w:ascii="Times New Roman" w:hAnsi="Times New Roman" w:cs="Times New Roman"/>
-                <w:color w:val="000000"/>
-                <w:sz w:val="20"/>
-                <w:szCs w:val="20"/>
-              </w:rPr>
-              <w:t>16:</w:t>
-            </w:r>
-          </w:p>
-        </w:tc>
-        <w:tc>
-          <w:tcPr>
-            <w:tcW w:w="8504" w:type="dxa"/>
-          </w:tcPr>
-          <w:p>
-            <w:pPr>
-              <w:spacing w:before="20" w:after="20"/>
-              <w:rPr>
-                <w:rFonts w:ascii="Times New Roman" w:hAnsi="Times New Roman" w:cs="Times New Roman"/>
-                <w:sz w:val="20"/>
-                <w:szCs w:val="20"/>
-              </w:rPr>
-            </w:pPr>
-            <w:r>
-              <w:rPr>
-                <w:rFonts w:ascii="Times New Roman" w:hAnsi="Times New Roman" w:cs="Times New Roman"/>
-                <w:b/>
-                <w:color w:val="000000"/>
-                <w:sz w:val="20"/>
-                <w:szCs w:val="20"/>
-              </w:rPr>
-              <w:t>else if</w:t>
-            </w:r>
-            <w:r>
-              <w:rPr>
-                <w:rFonts w:ascii="Times New Roman" w:hAnsi="Times New Roman" w:cs="Times New Roman"/>
-                <w:color w:val="000000"/>
-                <w:sz w:val="20"/>
-                <w:szCs w:val="20"/>
-              </w:rPr>
-              <w:t xml:space="preserve"> </w:t>
-            </w:r>
-            <w:r>
-              <w:rPr>
-                <w:rFonts w:ascii="Times New Roman" w:hAnsi="Times New Roman" w:cs="Times New Roman"/>
-                <w:i/>
-                <w:color w:val="000000"/>
-                <w:sz w:val="20"/>
-                <w:szCs w:val="20"/>
-              </w:rPr>
               <w:t>route</w:t>
             </w:r>
             <w:r>
@@ -3814,202 +4044,7 @@
             <w:r>
               <w:rPr>
                 <w:rFonts w:ascii="Times New Roman" w:hAnsi="Times New Roman" w:cs="Times New Roman"/>
-                <w:b/>
-                <w:color w:val="000000"/>
-                <w:sz w:val="20"/>
-                <w:szCs w:val="20"/>
-              </w:rPr>
-              <w:t>passthrough</w:t>
-            </w:r>
-            <w:r>
-              <w:rPr>
-                <w:rFonts w:ascii="Times New Roman" w:hAnsi="Times New Roman" w:cs="Times New Roman"/>
-                <w:color w:val="000000"/>
-                <w:sz w:val="20"/>
-                <w:szCs w:val="20"/>
-              </w:rPr>
-              <w:t xml:space="preserve"> </w:t>
-            </w:r>
-            <w:r>
-              <w:rPr>
-                <w:rFonts w:ascii="Times New Roman" w:hAnsi="Times New Roman" w:cs="Times New Roman"/>
-                <w:b/>
-                <w:color w:val="000000"/>
-                <w:sz w:val="20"/>
-                <w:szCs w:val="20"/>
-              </w:rPr>
-              <w:t>then</w:t>
-            </w:r>
-          </w:p>
-        </w:tc>
-      </w:tr>
-      <w:tr>
-        <w:tc>
-          <w:tcPr>
-            <w:tcW w:w="680" w:type="dxa"/>
-          </w:tcPr>
-          <w:p>
-            <w:pPr>
-              <w:spacing w:before="20" w:after="20"/>
-              <w:rPr>
-                <w:rFonts w:ascii="Times New Roman" w:hAnsi="Times New Roman" w:cs="Times New Roman"/>
-                <w:sz w:val="20"/>
-                <w:szCs w:val="20"/>
-              </w:rPr>
-            </w:pPr>
-            <w:r>
-              <w:rPr>
-                <w:rFonts w:ascii="Times New Roman" w:hAnsi="Times New Roman" w:cs="Times New Roman"/>
-                <w:color w:val="000000"/>
-                <w:sz w:val="20"/>
-                <w:szCs w:val="20"/>
-              </w:rPr>
-              <w:t>17:</w:t>
-            </w:r>
-          </w:p>
-        </w:tc>
-        <w:tc>
-          <w:tcPr>
-            <w:tcW w:w="8504" w:type="dxa"/>
-          </w:tcPr>
-          <w:p>
-            <w:pPr>
-              <w:spacing w:before="20" w:after="20"/>
-              <w:rPr>
-                <w:rFonts w:ascii="Times New Roman" w:hAnsi="Times New Roman" w:cs="Times New Roman"/>
-                <w:sz w:val="20"/>
-                <w:szCs w:val="20"/>
-              </w:rPr>
-            </w:pPr>
-            <w:r>
-              <w:rPr>
-                <w:rFonts w:ascii="Times New Roman" w:hAnsi="Times New Roman" w:cs="Times New Roman"/>
-                <w:color w:val="000000"/>
-                <w:sz w:val="20"/>
-                <w:szCs w:val="20"/>
-              </w:rPr>
-              <w:t xml:space="preserve">    </w:t>
-            </w:r>
-            <w:r>
-              <w:rPr>
-                <w:rFonts w:ascii="Times New Roman" w:hAnsi="Times New Roman" w:cs="Times New Roman"/>
-                <w:i/>
-                <w:color w:val="000000"/>
-                <w:sz w:val="20"/>
-                <w:szCs w:val="20"/>
-              </w:rPr>
-              <w:t>queue</w:t>
-            </w:r>
-            <w:r>
-              <w:rPr>
-                <w:rFonts w:ascii="Times New Roman" w:hAnsi="Times New Roman" w:cs="Times New Roman"/>
-                <w:color w:val="000000"/>
-                <w:sz w:val="20"/>
-                <w:szCs w:val="20"/>
-              </w:rPr>
-              <w:t xml:space="preserve"> ← </w:t>
-            </w:r>
-            <w:r>
-              <w:rPr>
-                <w:rFonts w:ascii="Times New Roman" w:hAnsi="Times New Roman" w:cs="Times New Roman"/>
-                <w:color w:val="000000"/>
-                <w:sz w:val="20"/>
-                <w:szCs w:val="20"/>
-              </w:rPr>
-              <w:t>[Response</w:t>
-            </w:r>
-            <w:r>
-              <w:rPr>
-                <w:rFonts w:ascii="Times New Roman" w:hAnsi="Times New Roman" w:cs="Times New Roman"/>
-                <w:color w:val="000000"/>
-                <w:sz w:val="20"/>
-                <w:szCs w:val="20"/>
-              </w:rPr>
-              <w:t>]</w:t>
-            </w:r>
-          </w:p>
-        </w:tc>
-      </w:tr>
-      <w:tr>
-        <w:tc>
-          <w:tcPr>
-            <w:tcW w:w="680" w:type="dxa"/>
-          </w:tcPr>
-          <w:p>
-            <w:pPr>
-              <w:spacing w:before="20" w:after="20"/>
-              <w:rPr>
-                <w:rFonts w:ascii="Times New Roman" w:hAnsi="Times New Roman" w:cs="Times New Roman"/>
-                <w:sz w:val="20"/>
-                <w:szCs w:val="20"/>
-              </w:rPr>
-            </w:pPr>
-            <w:r>
-              <w:rPr>
-                <w:rFonts w:ascii="Times New Roman" w:hAnsi="Times New Roman" w:cs="Times New Roman"/>
-                <w:color w:val="000000"/>
-                <w:sz w:val="20"/>
-                <w:szCs w:val="20"/>
-              </w:rPr>
-              <w:t>18:</w:t>
-            </w:r>
-          </w:p>
-        </w:tc>
-        <w:tc>
-          <w:tcPr>
-            <w:tcW w:w="8504" w:type="dxa"/>
-          </w:tcPr>
-          <w:p>
-            <w:pPr>
-              <w:spacing w:before="20" w:after="20"/>
-              <w:rPr>
-                <w:rFonts w:ascii="Times New Roman" w:hAnsi="Times New Roman" w:cs="Times New Roman"/>
-                <w:sz w:val="20"/>
-                <w:szCs w:val="20"/>
-              </w:rPr>
-            </w:pPr>
-            <w:r>
-              <w:rPr>
-                <w:rFonts w:ascii="Times New Roman" w:hAnsi="Times New Roman" w:cs="Times New Roman"/>
-                <w:b/>
-                <w:color w:val="000000"/>
-                <w:sz w:val="20"/>
-                <w:szCs w:val="20"/>
-              </w:rPr>
-              <w:t>else if</w:t>
-            </w:r>
-            <w:r>
-              <w:rPr>
-                <w:rFonts w:ascii="Times New Roman" w:hAnsi="Times New Roman" w:cs="Times New Roman"/>
-                <w:color w:val="000000"/>
-                <w:sz w:val="20"/>
-                <w:szCs w:val="20"/>
-              </w:rPr>
-              <w:t xml:space="preserve"> </w:t>
-            </w:r>
-            <w:r>
-              <w:rPr>
-                <w:rFonts w:ascii="Times New Roman" w:hAnsi="Times New Roman" w:cs="Times New Roman"/>
-                <w:i/>
-                <w:color w:val="000000"/>
-                <w:sz w:val="20"/>
-                <w:szCs w:val="20"/>
-              </w:rPr>
-              <w:t>route</w:t>
-            </w:r>
-            <w:r>
-              <w:rPr>
-                <w:rFonts w:ascii="Times New Roman" w:hAnsi="Times New Roman" w:cs="Times New Roman"/>
-                <w:color w:val="000000"/>
-                <w:sz w:val="20"/>
-                <w:szCs w:val="20"/>
-              </w:rPr>
-              <w:t xml:space="preserve"> = </w:t>
-            </w:r>
-            <w:r>
-              <w:rPr>
-                <w:rFonts w:ascii="Times New Roman" w:hAnsi="Times New Roman" w:cs="Times New Roman"/>
-                <w:b/>
+                <w:bCs/>
                 <w:color w:val="000000"/>
                 <w:sz w:val="20"/>
                 <w:szCs w:val="20"/>
@@ -4714,7 +4749,7 @@
                 <w:color w:val="808080"/>
                 <w:sz w:val="20"/>
               </w:rPr>
-              <w:t>// Step 3: Effort-Gated Analysis Loop</w:t>
+              <w:t>// Effort-Gated Analysis Loop</w:t>
             </w:r>
           </w:p>
         </w:tc>
@@ -5387,7 +5422,15 @@
                 <w:rFonts w:ascii="Times New Roman" w:hAnsi="Times New Roman"/>
                 <w:sz w:val="20"/>
               </w:rPr>
-              <w:t>result ← TaskExecute(active, context);   retries ← retries + 1;   decision ← ResultReview(result)</w:t>
+              <w:t xml:space="preserve">result ← TaskExecute(active, context);   retries ← retries + 1; </w:t>
+            </w:r>
+            <w:r>
+              <w:rPr>
+                <w:rFonts w:ascii="Times New Roman" w:hAnsi="Times New Roman"/>
+                <w:sz w:val="20"/>
+              </w:rPr>
+              <w:br/>
+              <w:t>decision ← ResultReview(result)</w:t>
             </w:r>
           </w:p>
         </w:tc>
@@ -5545,7 +5588,23 @@
                 <w:rFonts w:ascii="Times New Roman" w:hAnsi="Times New Roman"/>
                 <w:sz w:val="20"/>
               </w:rPr>
-              <w:t>TaskAssess(active);   TaskAnalyze(active, replan);   result ← TaskExecute(active, context)</w:t>
+              <w:t>TaskAssess(active);</w:t>
+            </w:r>
+            <w:r>
+              <w:rPr>
+                <w:rFonts w:ascii="Times New Roman" w:hAnsi="Times New Roman"/>
+                <w:sz w:val="20"/>
+              </w:rPr>
+              <w:br/>
+              <w:t>TaskAnalyze(active, replan);</w:t>
+            </w:r>
+            <w:r>
+              <w:rPr>
+                <w:rFonts w:ascii="Times New Roman" w:hAnsi="Times New Roman"/>
+                <w:sz w:val="20"/>
+              </w:rPr>
+              <w:br/>
+              <w:t>result ← TaskExecute(active, context)</w:t>
             </w:r>
           </w:p>
         </w:tc>
@@ -5659,7 +5718,15 @@
                 <w:rFonts w:ascii="Times New Roman" w:hAnsi="Times New Roman"/>
                 <w:sz w:val="20"/>
               </w:rPr>
-              <w:t xml:space="preserve"> {result};   active ← NextTask(rootTask)</w:t>
+              <w:t xml:space="preserve"> {result};</w:t>
+            </w:r>
+            <w:r>
+              <w:rPr>
+                <w:rFonts w:ascii="Times New Roman" w:hAnsi="Times New Roman"/>
+                <w:sz w:val="20"/>
+              </w:rPr>
+              <w:br/>
+              <w:t>active ← NextTask(rootTask)</w:t>
             </w:r>
           </w:p>
         </w:tc>

</xml_diff>